<commit_message>
Revise pre-read wording, add measurement exercise, fix references
- Rework opening, three-pillars, and Exercise 1/2 copy to reflect
  the "platform + methodology" framing and the 14-role taxonomy.
- Reorder three pillars to Technical Expertise → Delivery Excellence
  → Pipeline Growth and update descriptions.
- Sharpen Scenario A (boutique) and Scenario B (GSI) profiles with
  more texture — long-term engagements, growth-rate comparison to
  other practices in the firm.
- Add reflection prompt at end of three-pillars page.
- Expand Exercise 3 role-gap table from 2 to 4 rows.
- Add new Exercise 6 (Measuring What Matters) with leading/lagging
  indicator table per pillar; renumber One Thing to Exercise 7.
- Fix round-table reference (Exercise 5 → Exercise 7).
- Update estimated time from 30-40 to 45-50 minutes.

Co-Authored-By: Claude Opus 4.7 (1M context) <noreply@anthropic.com>
</commit_message>
<xml_diff>
--- a/story-app/guide/Connected-Enablement-Pre-Read.docx
+++ b/story-app/guide/Connected-Enablement-Pre-Read.docx
@@ -160,7 +160,7 @@
           <w:sz w:val="22"/>
           <w:szCs w:val="22"/>
         </w:rPr>
-        <w:t xml:space="preserve">Time required: approximately 30–40 minutes.</w:t>
+        <w:t xml:space="preserve">Time required: approximately 45–50 minutes.</w:t>
       </w:r>
     </w:p>
     <w:p>
@@ -202,7 +202,7 @@
           <w:sz w:val="22"/>
           <w:szCs w:val="22"/>
         </w:rPr>
-        <w:t xml:space="preserve">We are redesigning how Anaplan enables its partner ecosystem. Today, enablement is largely one-size-fits-all: a catalog of Academy courses, a handful of workshops, and an informal path from "new partner" to "delivering independently." That model doesn't scale, and it doesn't account for the reality that different roles need fundamentally different things.</w:t>
+        <w:t xml:space="preserve">We are taking a close look at how Anaplan enables and supports its partner ecosystem. Today, enablement is largely one-size-fits-all: a catalog of Academy courses, a handful of workshops, and an informal path from "new partner" to "delivering independently." It can be difficult to objectively assess where partners are in their enablement journeys, and to quickly create new journeys where needed. That current model is difficult to scale, challenging to automate, and it doesn't account for the reality that different roles may need fundamentally different things.</w:t>
       </w:r>
     </w:p>
     <w:p>
@@ -214,7 +214,7 @@
           <w:sz w:val="22"/>
           <w:szCs w:val="22"/>
         </w:rPr>
-        <w:t xml:space="preserve">The workshop will introduce a framework called Connected Enablement, built on three principles:</w:t>
+        <w:t xml:space="preserve">The workshop will introduce a framework called Connected Enablement, but it is really a platform and supporting methodology for partner engagement built on three principles:</w:t>
       </w:r>
     </w:p>
     <w:p>
@@ -239,7 +239,7 @@
           <w:sz w:val="22"/>
           <w:szCs w:val="22"/>
         </w:rPr>
-        <w:t xml:space="preserve">every role gets a recommended path with defined stages and clear progression criteria.</w:t>
+        <w:t xml:space="preserve">every role gets a recommended journey with defined stages and clear progression criteria.</w:t>
       </w:r>
     </w:p>
     <w:p>
@@ -264,7 +264,7 @@
           <w:sz w:val="22"/>
           <w:szCs w:val="22"/>
         </w:rPr>
-        <w:t xml:space="preserve">the path is shaped by role, product area, and experience level — not one curriculum for everyone.</w:t>
+        <w:t xml:space="preserve">journeys are shaped by role, product area, and experience level — not one curriculum for everyone.</w:t>
       </w:r>
     </w:p>
     <w:p>
@@ -301,7 +301,7 @@
           <w:sz w:val="22"/>
           <w:szCs w:val="22"/>
         </w:rPr>
-        <w:t xml:space="preserve">The workshop is a working session. We will define the building blocks together: which roles need journeys, what goes in each stage, what gates separate stages, and what achievements partners can earn. Your input before the session will make the conversation richer and faster.</w:t>
+        <w:t xml:space="preserve">The workshop is a working session where we will define the building blocks of how we engage with partners: which roles need journeys, what goes in each stage, what gates separate stages, what achievements partners can earn, and ultimately how we measure outcomes. Thinking through these topics and scenarios before the session will make the conversation richer and faster.</w:t>
       </w:r>
     </w:p>
     <w:p>
@@ -327,7 +327,7 @@
           <w:sz w:val="22"/>
           <w:szCs w:val="22"/>
         </w:rPr>
-        <w:t xml:space="preserve">Everything in Connected Enablement ties back to three business outcomes. As you read through the pre-work, keep asking: "Does this support pipeline growth, technical expertise, or delivery excellence — and how would we know?"</w:t>
+        <w:t xml:space="preserve">Everything in Connected Enablement ties back to business outcomes. As you read through the pre-work, keep asking: "Does this support pipeline growth, increase a partner's technical expertise, or ensure delivery excellence — and how would we know?"</w:t>
       </w:r>
     </w:p>
     <w:p>
@@ -342,7 +342,7 @@
           <w:sz w:val="24"/>
           <w:szCs w:val="24"/>
         </w:rPr>
-        <w:t xml:space="preserve">Pipeline Growth</w:t>
+        <w:t xml:space="preserve">Technical Expertise</w:t>
       </w:r>
     </w:p>
     <w:p>
@@ -354,7 +354,7 @@
           <w:sz w:val="22"/>
           <w:szCs w:val="22"/>
         </w:rPr>
-        <w:t xml:space="preserve">Equip partner sales and pre-sales teams to identify, qualify, position, present, and close Anaplan opportunities across every product and industry.</w:t>
+        <w:t xml:space="preserve">Build deep, certified capability across model building, application configuration, solution architecture, and the Anaplan platform.</w:t>
       </w:r>
     </w:p>
     <w:p>
@@ -369,7 +369,7 @@
           <w:sz w:val="24"/>
           <w:szCs w:val="24"/>
         </w:rPr>
-        <w:t xml:space="preserve">Technical Expertise</w:t>
+        <w:t xml:space="preserve">Delivery Excellence</w:t>
       </w:r>
     </w:p>
     <w:p>
@@ -381,7 +381,7 @@
           <w:sz w:val="22"/>
           <w:szCs w:val="22"/>
         </w:rPr>
-        <w:t xml:space="preserve">Build deep, certified capability across model building, application configuration, solution architecture, and the Anaplan platform.</w:t>
+        <w:t xml:space="preserve">Ensure every client engagement meets Anaplan's quality bar — from supervised delivery through delivering projects independently and consistently.</w:t>
       </w:r>
     </w:p>
     <w:p>
@@ -396,7 +396,7 @@
           <w:sz w:val="24"/>
           <w:szCs w:val="24"/>
         </w:rPr>
-        <w:t xml:space="preserve">Delivery Excellence</w:t>
+        <w:t xml:space="preserve">Pipeline Growth</w:t>
       </w:r>
     </w:p>
     <w:p>
@@ -408,7 +408,62 @@
           <w:sz w:val="22"/>
           <w:szCs w:val="22"/>
         </w:rPr>
-        <w:t xml:space="preserve">Ensure every client engagement meets Anaplan's quality bar — from supervised delivery through independent practice.</w:t>
+        <w:t xml:space="preserve">Equip partner business development teams to identify, qualify, position, present, and close Anaplan opportunities across every product and industry.</w:t>
+      </w:r>
+    </w:p>
+    <w:p>
+      <w:pPr>
+        <w:spacing w:after="60" w:before="120"/>
+      </w:pPr>
+      <w:r>
+        <w:rPr>
+          <w:b/>
+          <w:bCs/>
+          <w:color w:val="FF6100"/>
+          <w:sz w:val="18"/>
+          <w:szCs w:val="18"/>
+        </w:rPr>
+        <w:t xml:space="preserve">REFLECT  |  </w:t>
+      </w:r>
+      <w:r>
+        <w:rPr>
+          <w:b/>
+          <w:bCs/>
+          <w:color w:val="0A2F46"/>
+          <w:sz w:val="22"/>
+          <w:szCs w:val="22"/>
+        </w:rPr>
+        <w:t xml:space="preserve">Which of the three pillars feels weakest for partners today, and why?</w:t>
+      </w:r>
+    </w:p>
+    <w:p>
+      <w:r>
+        <w:rPr>
+          <w:color w:val="CCCCCC"/>
+          <w:sz w:val="20"/>
+          <w:szCs w:val="20"/>
+        </w:rPr>
+        <w:t xml:space="preserve">_______________________________________________________________________________</w:t>
+      </w:r>
+    </w:p>
+    <w:p>
+      <w:r>
+        <w:rPr>
+          <w:color w:val="CCCCCC"/>
+          <w:sz w:val="20"/>
+          <w:szCs w:val="20"/>
+        </w:rPr>
+        <w:t xml:space="preserve">_______________________________________________________________________________</w:t>
+      </w:r>
+    </w:p>
+    <w:p>
+      <w:r>
+        <w:rPr>
+          <w:color w:val="CCCCCC"/>
+          <w:sz w:val="20"/>
+          <w:szCs w:val="20"/>
+        </w:rPr>
+        <w:t xml:space="preserve">_______________________________________________________________________________</w:t>
       </w:r>
     </w:p>
     <w:p>
@@ -434,7 +489,7 @@
           <w:sz w:val="22"/>
           <w:szCs w:val="22"/>
         </w:rPr>
-        <w:t xml:space="preserve">Most partner enablement programs focus on two roles: model builders and solution architects. In reality, a partner organization has many more people who interact with Anaplan — and each of them needs something different.</w:t>
+        <w:t xml:space="preserve">Most partner enablement programs focus on three roles: sales, pre-sales, and delivery resources. In reality, a partner organization can have many more people who interact with Anaplan and their clients — and each of them often needs something different. Conversely, some Anaplan partners have just a few technical roles, and don't need the journeys that larger, more complex teams may need.</w:t>
       </w:r>
     </w:p>
     <w:p>
@@ -446,7 +501,7 @@
           <w:sz w:val="22"/>
           <w:szCs w:val="22"/>
         </w:rPr>
-        <w:t xml:space="preserve">We have identified fourteen roles grouped into five categories that reflect how partner teams are organized. Review the list below and think about whether it captures your partner ecosystem completely.</w:t>
+        <w:t xml:space="preserve">We have identified fourteen roles grouped into five categories that reflect how partner teams may be organized. Review the list below and think about whether it captures your partner ecosystem completely — from the very large to the very small.</w:t>
       </w:r>
     </w:p>
     <w:tbl>
@@ -1431,7 +1486,7 @@
           <w:sz w:val="22"/>
           <w:szCs w:val="22"/>
         </w:rPr>
-        <w:t xml:space="preserve">Are there roles missing from this list? Think about your own organization or your partners — who interacts with Anaplan that isn't represented here?</w:t>
+        <w:t xml:space="preserve">Are there roles missing from this list? Imagine yourself as an Anaplan partner — who would need to interact with Anaplan and your clients that isn't represented here?</w:t>
       </w:r>
     </w:p>
     <w:p>
@@ -1597,7 +1652,7 @@
           <w:sz w:val="22"/>
           <w:szCs w:val="22"/>
         </w:rPr>
-        <w:t xml:space="preserve">For a moment, put yourself in the shoes of two very different Anaplan partner owners. Read both scenarios, then answer the questions below. The point of this exercise is to get past the idea that there is one kind of partner — and that one enablement program serves them all.</w:t>
+        <w:t xml:space="preserve">For a moment, imagine yourself in the shoes of two very different Anaplan partners. Read both scenarios and profiles, then answer the questions below. The point of this exercise is to get past the idea that there is one kind of partner — and that one generic enablement program serving them all.</w:t>
       </w:r>
     </w:p>
     <w:p>
@@ -1618,7 +1673,7 @@
           <w:sz w:val="22"/>
           <w:szCs w:val="22"/>
         </w:rPr>
-        <w:t xml:space="preserve">You own a boutique Anaplan partner. Your team has grown to 15 people — a deep bench of industry and technical experts who know everything there is to know about CPG Supply Chain challenges, with a specialty in Trade Promotion Management. Your clients trust you and your team completely. You have delivered several complex Anaplan projects, including custom Trade Promotion planning models that your competitors cannot match.</w:t>
+        <w:t xml:space="preserve">You own and lead a boutique consulting firm that specializes in Anaplan engagements. Over the years, your team has grown to 15 people — a deep bench of industry and technical experts who know everything there is to know about CPG Supply Chain challenges, with a specialty in Trade Promotion Management. Your clients trust you and your team completely. You have delivered several complex Anaplan projects, including custom Trade Promotion planning models that your competitors cannot match. Your clients have tried just about every other TPM solution and are happy with your approach and experience with Anaplan.</w:t>
       </w:r>
     </w:p>
     <w:p>
@@ -1642,7 +1697,7 @@
           <w:sz w:val="22"/>
           <w:szCs w:val="22"/>
         </w:rPr>
-        <w:t xml:space="preserve">Your engagements are highly configured, deeply customized, and precisely address each client's unique business requirements. You deliver great projects, consistently, to a small set of clients who become long-term partners.</w:t>
+        <w:t xml:space="preserve">Your engagements are highly configured, deeply customized, and precisely address each client's unique business requirements. You deliver great projects, consistently, to a small set of clients who become long-term engagements.</w:t>
       </w:r>
     </w:p>
     <w:p>
@@ -1663,7 +1718,7 @@
           <w:sz w:val="22"/>
           <w:szCs w:val="22"/>
         </w:rPr>
-        <w:t xml:space="preserve">You lead the Anaplan practice at a large Global System Integrator. You have hundreds of Anaplan-trained resources spread across multiple continents, delivering implementations for Fortune 500 clients across every industry Anaplan sells into. Your practice grows 30% year over year — you are constantly hiring, training, and onboarding new resources.</w:t>
+        <w:t xml:space="preserve">You lead the Anaplan practice at a large Global System Integrator. You have hundreds of Anaplan-trained resources spread across multiple continents, delivering implementations for Fortune 500 clients across every industry Anaplan sells into. Your practice grows 30% year over year — you are constantly hiring, training, and onboarding new resources. 30% annual growth may seem nice, but other practices in your firm are growing 3x as fast with a more predictable resource pool and higher margins.</w:t>
       </w:r>
     </w:p>
     <w:p>
@@ -2369,6 +2424,170 @@
           </w:p>
         </w:tc>
       </w:tr>
+      <w:tr>
+        <w:tc>
+          <w:tcPr>
+            <w:tcW w:type="dxa" w:w="2250"/>
+            <w:tcBorders>
+              <w:top w:val="single" w:color="D8D6D0" w:sz="1"/>
+              <w:left w:val="single" w:color="D8D6D0" w:sz="1"/>
+              <w:bottom w:val="single" w:color="D8D6D0" w:sz="1"/>
+              <w:right w:val="single" w:color="D8D6D0" w:sz="1"/>
+            </w:tcBorders>
+          </w:tcPr>
+          <w:p>
+            <w:r>
+              <w:rPr>
+                <w:sz w:val="18"/>
+                <w:szCs w:val="18"/>
+              </w:rPr>
+              <w:t xml:space="preserve"/>
+            </w:r>
+          </w:p>
+        </w:tc>
+        <w:tc>
+          <w:tcPr>
+            <w:tcW w:type="dxa" w:w="2250"/>
+            <w:tcBorders>
+              <w:top w:val="single" w:color="D8D6D0" w:sz="1"/>
+              <w:left w:val="single" w:color="D8D6D0" w:sz="1"/>
+              <w:bottom w:val="single" w:color="D8D6D0" w:sz="1"/>
+              <w:right w:val="single" w:color="D8D6D0" w:sz="1"/>
+            </w:tcBorders>
+          </w:tcPr>
+          <w:p>
+            <w:r>
+              <w:rPr>
+                <w:sz w:val="18"/>
+                <w:szCs w:val="18"/>
+              </w:rPr>
+              <w:t xml:space="preserve"/>
+            </w:r>
+          </w:p>
+        </w:tc>
+        <w:tc>
+          <w:tcPr>
+            <w:tcW w:type="dxa" w:w="2250"/>
+            <w:tcBorders>
+              <w:top w:val="single" w:color="D8D6D0" w:sz="1"/>
+              <w:left w:val="single" w:color="D8D6D0" w:sz="1"/>
+              <w:bottom w:val="single" w:color="D8D6D0" w:sz="1"/>
+              <w:right w:val="single" w:color="D8D6D0" w:sz="1"/>
+            </w:tcBorders>
+          </w:tcPr>
+          <w:p>
+            <w:r>
+              <w:rPr>
+                <w:sz w:val="18"/>
+                <w:szCs w:val="18"/>
+              </w:rPr>
+              <w:t xml:space="preserve"/>
+            </w:r>
+          </w:p>
+        </w:tc>
+        <w:tc>
+          <w:tcPr>
+            <w:tcW w:type="dxa" w:w="2250"/>
+            <w:tcBorders>
+              <w:top w:val="single" w:color="D8D6D0" w:sz="1"/>
+              <w:left w:val="single" w:color="D8D6D0" w:sz="1"/>
+              <w:bottom w:val="single" w:color="D8D6D0" w:sz="1"/>
+              <w:right w:val="single" w:color="D8D6D0" w:sz="1"/>
+            </w:tcBorders>
+          </w:tcPr>
+          <w:p>
+            <w:r>
+              <w:rPr>
+                <w:sz w:val="18"/>
+                <w:szCs w:val="18"/>
+              </w:rPr>
+              <w:t xml:space="preserve"/>
+            </w:r>
+          </w:p>
+        </w:tc>
+      </w:tr>
+      <w:tr>
+        <w:tc>
+          <w:tcPr>
+            <w:tcW w:type="dxa" w:w="2250"/>
+            <w:tcBorders>
+              <w:top w:val="single" w:color="D8D6D0" w:sz="1"/>
+              <w:left w:val="single" w:color="D8D6D0" w:sz="1"/>
+              <w:bottom w:val="single" w:color="D8D6D0" w:sz="1"/>
+              <w:right w:val="single" w:color="D8D6D0" w:sz="1"/>
+            </w:tcBorders>
+          </w:tcPr>
+          <w:p>
+            <w:r>
+              <w:rPr>
+                <w:sz w:val="18"/>
+                <w:szCs w:val="18"/>
+              </w:rPr>
+              <w:t xml:space="preserve"/>
+            </w:r>
+          </w:p>
+        </w:tc>
+        <w:tc>
+          <w:tcPr>
+            <w:tcW w:type="dxa" w:w="2250"/>
+            <w:tcBorders>
+              <w:top w:val="single" w:color="D8D6D0" w:sz="1"/>
+              <w:left w:val="single" w:color="D8D6D0" w:sz="1"/>
+              <w:bottom w:val="single" w:color="D8D6D0" w:sz="1"/>
+              <w:right w:val="single" w:color="D8D6D0" w:sz="1"/>
+            </w:tcBorders>
+          </w:tcPr>
+          <w:p>
+            <w:r>
+              <w:rPr>
+                <w:sz w:val="18"/>
+                <w:szCs w:val="18"/>
+              </w:rPr>
+              <w:t xml:space="preserve"/>
+            </w:r>
+          </w:p>
+        </w:tc>
+        <w:tc>
+          <w:tcPr>
+            <w:tcW w:type="dxa" w:w="2250"/>
+            <w:tcBorders>
+              <w:top w:val="single" w:color="D8D6D0" w:sz="1"/>
+              <w:left w:val="single" w:color="D8D6D0" w:sz="1"/>
+              <w:bottom w:val="single" w:color="D8D6D0" w:sz="1"/>
+              <w:right w:val="single" w:color="D8D6D0" w:sz="1"/>
+            </w:tcBorders>
+          </w:tcPr>
+          <w:p>
+            <w:r>
+              <w:rPr>
+                <w:sz w:val="18"/>
+                <w:szCs w:val="18"/>
+              </w:rPr>
+              <w:t xml:space="preserve"/>
+            </w:r>
+          </w:p>
+        </w:tc>
+        <w:tc>
+          <w:tcPr>
+            <w:tcW w:type="dxa" w:w="2250"/>
+            <w:tcBorders>
+              <w:top w:val="single" w:color="D8D6D0" w:sz="1"/>
+              <w:left w:val="single" w:color="D8D6D0" w:sz="1"/>
+              <w:bottom w:val="single" w:color="D8D6D0" w:sz="1"/>
+              <w:right w:val="single" w:color="D8D6D0" w:sz="1"/>
+            </w:tcBorders>
+          </w:tcPr>
+          <w:p>
+            <w:r>
+              <w:rPr>
+                <w:sz w:val="18"/>
+                <w:szCs w:val="18"/>
+              </w:rPr>
+              <w:t xml:space="preserve"/>
+            </w:r>
+          </w:p>
+        </w:tc>
+      </w:tr>
     </w:tbl>
     <w:p>
       <w:r>
@@ -2883,7 +3102,7 @@
         <w:spacing w:after="160" w:before="400"/>
       </w:pPr>
       <w:r>
-        <w:t xml:space="preserve">Exercise 6 — One Thing (2 minutes)</w:t>
+        <w:t xml:space="preserve">Exercise 6 — Measuring What Matters (3 minutes)</w:t>
       </w:r>
     </w:p>
     <w:p>
@@ -2895,9 +3114,384 @@
           <w:sz w:val="22"/>
           <w:szCs w:val="22"/>
         </w:rPr>
-        <w:t xml:space="preserve">This is the question we will open the workshop with. Take a moment to think about it now so you are ready to share.</w:t>
-      </w:r>
-    </w:p>
+        <w:t xml:space="preserve">Connected Enablement only works if we can tell whether it is working. Every pillar, every journey, every achievement should connect to something measurable — not just training completions, but the business outcomes they are meant to drive.</w:t>
+      </w:r>
+    </w:p>
+    <w:p>
+      <w:pPr>
+        <w:spacing w:after="120" w:before="40"/>
+      </w:pPr>
+      <w:r>
+        <w:rPr>
+          <w:sz w:val="22"/>
+          <w:szCs w:val="22"/>
+        </w:rPr>
+        <w:t xml:space="preserve">For each pillar, sketch one leading indicator (an early signal) and one lagging indicator (the outcome itself). Don't worry about perfection — rough is fine.</w:t>
+      </w:r>
+    </w:p>
+    <w:tbl>
+      <w:tblPr>
+        <w:tblW w:type="dxa" w:w="9000"/>
+        <w:tblBorders>
+          <w:top w:val="single" w:color="auto" w:sz="4"/>
+          <w:left w:val="single" w:color="auto" w:sz="4"/>
+          <w:bottom w:val="single" w:color="auto" w:sz="4"/>
+          <w:right w:val="single" w:color="auto" w:sz="4"/>
+          <w:insideH w:val="single" w:color="auto" w:sz="4"/>
+          <w:insideV w:val="single" w:color="auto" w:sz="4"/>
+        </w:tblBorders>
+      </w:tblPr>
+      <w:tblGrid>
+        <w:gridCol w:w="100"/>
+        <w:gridCol w:w="100"/>
+        <w:gridCol w:w="100"/>
+        <w:gridCol w:w="100"/>
+      </w:tblGrid>
+      <w:tr>
+        <w:tc>
+          <w:tcPr>
+            <w:tcW w:type="dxa" w:w="2250"/>
+            <w:tcBorders>
+              <w:top w:val="single" w:color="D8D6D0" w:sz="1"/>
+              <w:left w:val="single" w:color="D8D6D0" w:sz="1"/>
+              <w:bottom w:val="single" w:color="D8D6D0" w:sz="1"/>
+              <w:right w:val="single" w:color="D8D6D0" w:sz="1"/>
+            </w:tcBorders>
+            <w:shd w:fill="0A2F46" w:val="solid"/>
+          </w:tcPr>
+          <w:p>
+            <w:r>
+              <w:rPr>
+                <w:b/>
+                <w:bCs/>
+                <w:color w:val="FFFFFF"/>
+                <w:sz w:val="18"/>
+                <w:szCs w:val="18"/>
+              </w:rPr>
+              <w:t xml:space="preserve">Pillar</w:t>
+            </w:r>
+          </w:p>
+        </w:tc>
+        <w:tc>
+          <w:tcPr>
+            <w:tcW w:type="dxa" w:w="2250"/>
+            <w:tcBorders>
+              <w:top w:val="single" w:color="D8D6D0" w:sz="1"/>
+              <w:left w:val="single" w:color="D8D6D0" w:sz="1"/>
+              <w:bottom w:val="single" w:color="D8D6D0" w:sz="1"/>
+              <w:right w:val="single" w:color="D8D6D0" w:sz="1"/>
+            </w:tcBorders>
+            <w:shd w:fill="0A2F46" w:val="solid"/>
+          </w:tcPr>
+          <w:p>
+            <w:r>
+              <w:rPr>
+                <w:b/>
+                <w:bCs/>
+                <w:color w:val="FFFFFF"/>
+                <w:sz w:val="18"/>
+                <w:szCs w:val="18"/>
+              </w:rPr>
+              <w:t xml:space="preserve">Leading indicator</w:t>
+            </w:r>
+          </w:p>
+        </w:tc>
+        <w:tc>
+          <w:tcPr>
+            <w:tcW w:type="dxa" w:w="2250"/>
+            <w:tcBorders>
+              <w:top w:val="single" w:color="D8D6D0" w:sz="1"/>
+              <w:left w:val="single" w:color="D8D6D0" w:sz="1"/>
+              <w:bottom w:val="single" w:color="D8D6D0" w:sz="1"/>
+              <w:right w:val="single" w:color="D8D6D0" w:sz="1"/>
+            </w:tcBorders>
+            <w:shd w:fill="0A2F46" w:val="solid"/>
+          </w:tcPr>
+          <w:p>
+            <w:r>
+              <w:rPr>
+                <w:b/>
+                <w:bCs/>
+                <w:color w:val="FFFFFF"/>
+                <w:sz w:val="18"/>
+                <w:szCs w:val="18"/>
+              </w:rPr>
+              <w:t xml:space="preserve">Lagging indicator</w:t>
+            </w:r>
+          </w:p>
+        </w:tc>
+        <w:tc>
+          <w:tcPr>
+            <w:tcW w:type="dxa" w:w="2250"/>
+            <w:tcBorders>
+              <w:top w:val="single" w:color="D8D6D0" w:sz="1"/>
+              <w:left w:val="single" w:color="D8D6D0" w:sz="1"/>
+              <w:bottom w:val="single" w:color="D8D6D0" w:sz="1"/>
+              <w:right w:val="single" w:color="D8D6D0" w:sz="1"/>
+            </w:tcBorders>
+            <w:shd w:fill="0A2F46" w:val="solid"/>
+          </w:tcPr>
+          <w:p>
+            <w:r>
+              <w:rPr>
+                <w:b/>
+                <w:bCs/>
+                <w:color w:val="FFFFFF"/>
+                <w:sz w:val="18"/>
+                <w:szCs w:val="18"/>
+              </w:rPr>
+              <w:t xml:space="preserve">Data source (if known)</w:t>
+            </w:r>
+          </w:p>
+        </w:tc>
+      </w:tr>
+      <w:tr>
+        <w:tc>
+          <w:tcPr>
+            <w:tcW w:type="dxa" w:w="2250"/>
+            <w:tcBorders>
+              <w:top w:val="single" w:color="D8D6D0" w:sz="1"/>
+              <w:left w:val="single" w:color="D8D6D0" w:sz="1"/>
+              <w:bottom w:val="single" w:color="D8D6D0" w:sz="1"/>
+              <w:right w:val="single" w:color="D8D6D0" w:sz="1"/>
+            </w:tcBorders>
+          </w:tcPr>
+          <w:p>
+            <w:r>
+              <w:rPr>
+                <w:sz w:val="18"/>
+                <w:szCs w:val="18"/>
+              </w:rPr>
+              <w:t xml:space="preserve">Technical Expertise</w:t>
+            </w:r>
+          </w:p>
+        </w:tc>
+        <w:tc>
+          <w:tcPr>
+            <w:tcW w:type="dxa" w:w="2250"/>
+            <w:tcBorders>
+              <w:top w:val="single" w:color="D8D6D0" w:sz="1"/>
+              <w:left w:val="single" w:color="D8D6D0" w:sz="1"/>
+              <w:bottom w:val="single" w:color="D8D6D0" w:sz="1"/>
+              <w:right w:val="single" w:color="D8D6D0" w:sz="1"/>
+            </w:tcBorders>
+          </w:tcPr>
+          <w:p>
+            <w:r>
+              <w:rPr>
+                <w:sz w:val="18"/>
+                <w:szCs w:val="18"/>
+              </w:rPr>
+              <w:t xml:space="preserve"/>
+            </w:r>
+          </w:p>
+        </w:tc>
+        <w:tc>
+          <w:tcPr>
+            <w:tcW w:type="dxa" w:w="2250"/>
+            <w:tcBorders>
+              <w:top w:val="single" w:color="D8D6D0" w:sz="1"/>
+              <w:left w:val="single" w:color="D8D6D0" w:sz="1"/>
+              <w:bottom w:val="single" w:color="D8D6D0" w:sz="1"/>
+              <w:right w:val="single" w:color="D8D6D0" w:sz="1"/>
+            </w:tcBorders>
+          </w:tcPr>
+          <w:p>
+            <w:r>
+              <w:rPr>
+                <w:sz w:val="18"/>
+                <w:szCs w:val="18"/>
+              </w:rPr>
+              <w:t xml:space="preserve"/>
+            </w:r>
+          </w:p>
+        </w:tc>
+        <w:tc>
+          <w:tcPr>
+            <w:tcW w:type="dxa" w:w="2250"/>
+            <w:tcBorders>
+              <w:top w:val="single" w:color="D8D6D0" w:sz="1"/>
+              <w:left w:val="single" w:color="D8D6D0" w:sz="1"/>
+              <w:bottom w:val="single" w:color="D8D6D0" w:sz="1"/>
+              <w:right w:val="single" w:color="D8D6D0" w:sz="1"/>
+            </w:tcBorders>
+          </w:tcPr>
+          <w:p>
+            <w:r>
+              <w:rPr>
+                <w:sz w:val="18"/>
+                <w:szCs w:val="18"/>
+              </w:rPr>
+              <w:t xml:space="preserve"/>
+            </w:r>
+          </w:p>
+        </w:tc>
+      </w:tr>
+      <w:tr>
+        <w:tc>
+          <w:tcPr>
+            <w:tcW w:type="dxa" w:w="2250"/>
+            <w:tcBorders>
+              <w:top w:val="single" w:color="D8D6D0" w:sz="1"/>
+              <w:left w:val="single" w:color="D8D6D0" w:sz="1"/>
+              <w:bottom w:val="single" w:color="D8D6D0" w:sz="1"/>
+              <w:right w:val="single" w:color="D8D6D0" w:sz="1"/>
+            </w:tcBorders>
+          </w:tcPr>
+          <w:p>
+            <w:r>
+              <w:rPr>
+                <w:sz w:val="18"/>
+                <w:szCs w:val="18"/>
+              </w:rPr>
+              <w:t xml:space="preserve">Delivery Excellence</w:t>
+            </w:r>
+          </w:p>
+        </w:tc>
+        <w:tc>
+          <w:tcPr>
+            <w:tcW w:type="dxa" w:w="2250"/>
+            <w:tcBorders>
+              <w:top w:val="single" w:color="D8D6D0" w:sz="1"/>
+              <w:left w:val="single" w:color="D8D6D0" w:sz="1"/>
+              <w:bottom w:val="single" w:color="D8D6D0" w:sz="1"/>
+              <w:right w:val="single" w:color="D8D6D0" w:sz="1"/>
+            </w:tcBorders>
+          </w:tcPr>
+          <w:p>
+            <w:r>
+              <w:rPr>
+                <w:sz w:val="18"/>
+                <w:szCs w:val="18"/>
+              </w:rPr>
+              <w:t xml:space="preserve"/>
+            </w:r>
+          </w:p>
+        </w:tc>
+        <w:tc>
+          <w:tcPr>
+            <w:tcW w:type="dxa" w:w="2250"/>
+            <w:tcBorders>
+              <w:top w:val="single" w:color="D8D6D0" w:sz="1"/>
+              <w:left w:val="single" w:color="D8D6D0" w:sz="1"/>
+              <w:bottom w:val="single" w:color="D8D6D0" w:sz="1"/>
+              <w:right w:val="single" w:color="D8D6D0" w:sz="1"/>
+            </w:tcBorders>
+          </w:tcPr>
+          <w:p>
+            <w:r>
+              <w:rPr>
+                <w:sz w:val="18"/>
+                <w:szCs w:val="18"/>
+              </w:rPr>
+              <w:t xml:space="preserve"/>
+            </w:r>
+          </w:p>
+        </w:tc>
+        <w:tc>
+          <w:tcPr>
+            <w:tcW w:type="dxa" w:w="2250"/>
+            <w:tcBorders>
+              <w:top w:val="single" w:color="D8D6D0" w:sz="1"/>
+              <w:left w:val="single" w:color="D8D6D0" w:sz="1"/>
+              <w:bottom w:val="single" w:color="D8D6D0" w:sz="1"/>
+              <w:right w:val="single" w:color="D8D6D0" w:sz="1"/>
+            </w:tcBorders>
+          </w:tcPr>
+          <w:p>
+            <w:r>
+              <w:rPr>
+                <w:sz w:val="18"/>
+                <w:szCs w:val="18"/>
+              </w:rPr>
+              <w:t xml:space="preserve"/>
+            </w:r>
+          </w:p>
+        </w:tc>
+      </w:tr>
+      <w:tr>
+        <w:tc>
+          <w:tcPr>
+            <w:tcW w:type="dxa" w:w="2250"/>
+            <w:tcBorders>
+              <w:top w:val="single" w:color="D8D6D0" w:sz="1"/>
+              <w:left w:val="single" w:color="D8D6D0" w:sz="1"/>
+              <w:bottom w:val="single" w:color="D8D6D0" w:sz="1"/>
+              <w:right w:val="single" w:color="D8D6D0" w:sz="1"/>
+            </w:tcBorders>
+          </w:tcPr>
+          <w:p>
+            <w:r>
+              <w:rPr>
+                <w:sz w:val="18"/>
+                <w:szCs w:val="18"/>
+              </w:rPr>
+              <w:t xml:space="preserve">Pipeline Growth</w:t>
+            </w:r>
+          </w:p>
+        </w:tc>
+        <w:tc>
+          <w:tcPr>
+            <w:tcW w:type="dxa" w:w="2250"/>
+            <w:tcBorders>
+              <w:top w:val="single" w:color="D8D6D0" w:sz="1"/>
+              <w:left w:val="single" w:color="D8D6D0" w:sz="1"/>
+              <w:bottom w:val="single" w:color="D8D6D0" w:sz="1"/>
+              <w:right w:val="single" w:color="D8D6D0" w:sz="1"/>
+            </w:tcBorders>
+          </w:tcPr>
+          <w:p>
+            <w:r>
+              <w:rPr>
+                <w:sz w:val="18"/>
+                <w:szCs w:val="18"/>
+              </w:rPr>
+              <w:t xml:space="preserve"/>
+            </w:r>
+          </w:p>
+        </w:tc>
+        <w:tc>
+          <w:tcPr>
+            <w:tcW w:type="dxa" w:w="2250"/>
+            <w:tcBorders>
+              <w:top w:val="single" w:color="D8D6D0" w:sz="1"/>
+              <w:left w:val="single" w:color="D8D6D0" w:sz="1"/>
+              <w:bottom w:val="single" w:color="D8D6D0" w:sz="1"/>
+              <w:right w:val="single" w:color="D8D6D0" w:sz="1"/>
+            </w:tcBorders>
+          </w:tcPr>
+          <w:p>
+            <w:r>
+              <w:rPr>
+                <w:sz w:val="18"/>
+                <w:szCs w:val="18"/>
+              </w:rPr>
+              <w:t xml:space="preserve"/>
+            </w:r>
+          </w:p>
+        </w:tc>
+        <w:tc>
+          <w:tcPr>
+            <w:tcW w:type="dxa" w:w="2250"/>
+            <w:tcBorders>
+              <w:top w:val="single" w:color="D8D6D0" w:sz="1"/>
+              <w:left w:val="single" w:color="D8D6D0" w:sz="1"/>
+              <w:bottom w:val="single" w:color="D8D6D0" w:sz="1"/>
+              <w:right w:val="single" w:color="D8D6D0" w:sz="1"/>
+            </w:tcBorders>
+          </w:tcPr>
+          <w:p>
+            <w:r>
+              <w:rPr>
+                <w:sz w:val="18"/>
+                <w:szCs w:val="18"/>
+              </w:rPr>
+              <w:t xml:space="preserve"/>
+            </w:r>
+          </w:p>
+        </w:tc>
+      </w:tr>
+    </w:tbl>
     <w:p>
       <w:pPr>
         <w:spacing w:after="60" w:before="120"/>
@@ -2920,6 +3514,87 @@
           <w:sz w:val="22"/>
           <w:szCs w:val="22"/>
         </w:rPr>
+        <w:t xml:space="preserve">Of the metrics above, which one do we NOT measure today but probably should? What is stopping us?</w:t>
+      </w:r>
+    </w:p>
+    <w:p>
+      <w:r>
+        <w:rPr>
+          <w:color w:val="CCCCCC"/>
+          <w:sz w:val="20"/>
+          <w:szCs w:val="20"/>
+        </w:rPr>
+        <w:t xml:space="preserve">_______________________________________________________________________________</w:t>
+      </w:r>
+    </w:p>
+    <w:p>
+      <w:r>
+        <w:rPr>
+          <w:color w:val="CCCCCC"/>
+          <w:sz w:val="20"/>
+          <w:szCs w:val="20"/>
+        </w:rPr>
+        <w:t xml:space="preserve">_______________________________________________________________________________</w:t>
+      </w:r>
+    </w:p>
+    <w:p>
+      <w:r>
+        <w:rPr>
+          <w:color w:val="CCCCCC"/>
+          <w:sz w:val="20"/>
+          <w:szCs w:val="20"/>
+        </w:rPr>
+        <w:t xml:space="preserve">_______________________________________________________________________________</w:t>
+      </w:r>
+    </w:p>
+    <w:p>
+      <w:r>
+        <w:br w:type="page"/>
+      </w:r>
+    </w:p>
+    <w:p>
+      <w:pPr>
+        <w:pStyle w:val="Heading1"/>
+        <w:spacing w:after="160" w:before="400"/>
+      </w:pPr>
+      <w:r>
+        <w:t xml:space="preserve">Exercise 7 — One Thing (2 minutes)</w:t>
+      </w:r>
+    </w:p>
+    <w:p>
+      <w:pPr>
+        <w:spacing w:after="120" w:before="40"/>
+      </w:pPr>
+      <w:r>
+        <w:rPr>
+          <w:sz w:val="22"/>
+          <w:szCs w:val="22"/>
+        </w:rPr>
+        <w:t xml:space="preserve">This is the question we will open the workshop with. Take a moment to think about it now so you are ready to share.</w:t>
+      </w:r>
+    </w:p>
+    <w:p>
+      <w:pPr>
+        <w:spacing w:after="60" w:before="120"/>
+      </w:pPr>
+      <w:r>
+        <w:rPr>
+          <w:b/>
+          <w:bCs/>
+          <w:color w:val="FF6100"/>
+          <w:sz w:val="18"/>
+          <w:szCs w:val="18"/>
+        </w:rPr>
+        <w:t xml:space="preserve">REFLECT  |  </w:t>
+      </w:r>
+      <w:r>
+        <w:rPr>
+          <w:b/>
+          <w:bCs/>
+          <w:color w:val="0A2F46"/>
+          <w:sz w:val="22"/>
+          <w:szCs w:val="22"/>
+        </w:rPr>
         <w:t xml:space="preserve">If you could fix ONE thing about how Anaplan enables its partners today, what would it be and why?</w:t>
       </w:r>
     </w:p>
@@ -3002,7 +3677,7 @@
           <w:sz w:val="22"/>
           <w:szCs w:val="22"/>
         </w:rPr>
-        <w:t xml:space="preserve">Open with a round-table: each participant shares their answer to Exercise 5</w:t>
+        <w:t xml:space="preserve">Open with a round-table: each participant shares their answer to Exercise 7</w:t>
       </w:r>
     </w:p>
     <w:p>

</xml_diff>